<commit_message>
Revision du proforma ATINKOU : perimetre et montants ajustes
- Suppression de la ligne actionneur electrique ROTORK
- Transmetteur SITRANS P320 porte a 3 unites (395 000 x 3)
- Positionneur ROTORK YTC YT-200 ramene a 275 000
- Suppression de la ligne enlevement / restitution du materiel
- Essais de validation sur banc portes a 6 unites
- Conditions mises a jour : logistique a la charge du client,
  frais de transport retires des clauses Prix et Diagnostic

Nouveau total : 2 720 000 HT / 2 584 000 net HT / 3 049 120 TTC.

Co-Authored-By: Claude Opus 5 <noreply@anthropic.com>
Claude-Session: https://claude.ai/code/session_012D3xncAniQbmajvLrDnCcc
</commit_message>
<xml_diff>
--- a/docs/proformas/atinkou/Proforma_ATINKOU_PRO-2026-014.docx
+++ b/docs/proformas/atinkou/Proforma_ATINKOU_PRO-2026-014.docx
@@ -353,7 +353,7 @@
           <w:sz w:val="19"/>
           <w:szCs w:val="19"/>
         </w:rPr>
-        <w:t xml:space="preserve">Suite à votre demande et à l’examen du matériel qui nous a été confié, nous avons l’honneur de vous soumettre notre proposition chiffrée pour le diagnostic, la réparation et la remise en service des cinq équipements listés ci-dessous. Les prestations comprennent les essais de validation en atelier et la remise d’un dossier technique.</w:t>
+        <w:t xml:space="preserve">Suite à votre demande et à l’examen du matériel qui nous a été confié, nous avons l’honneur de vous soumettre notre proposition chiffrée pour le diagnostic, la réparation et la remise en service des équipements listés ci-dessous (six unités). Les prestations comprennent les essais de validation en atelier et la remise d’un dossier technique.</w:t>
       </w:r>
     </w:p>
     <w:tbl>
@@ -863,7 +863,7 @@
                 <w:sz w:val="18"/>
                 <w:szCs w:val="18"/>
               </w:rPr>
-              <w:t xml:space="preserve">Actionneur électrique ROTORK (commande locale + volant de secours)</w:t>
+              <w:t xml:space="preserve">Transmetteur de pression SIEMENS SITRANS P320</w:t>
             </w:r>
           </w:p>
           <w:p>
@@ -882,7 +882,7 @@
                 <w:sz w:val="16"/>
                 <w:szCs w:val="16"/>
               </w:rPr>
-              <w:t xml:space="preserve">Diagnostic complet, remise en état de la carte de commande et des contacteurs,</w:t>
+              <w:t xml:space="preserve">Réf. 7MF03D0-1VE01-5AF2-Z · 4-20 mA HART · 10,5-45 V DC · IP66</w:t>
             </w:r>
           </w:p>
           <w:p>
@@ -901,7 +901,7 @@
                 <w:sz w:val="16"/>
                 <w:szCs w:val="16"/>
               </w:rPr>
-              <w:t xml:space="preserve">contrôle du moteur et des isolements, réglage des fins de course et du limiteur</w:t>
+              <w:t xml:space="preserve">Diagnostic électronique, remise en état, contrôle d’étanchéité de la cellule,</w:t>
             </w:r>
           </w:p>
           <w:p>
@@ -920,164 +920,7 @@
                 <w:sz w:val="16"/>
                 <w:szCs w:val="16"/>
               </w:rPr>
-              <w:t xml:space="preserve">de couple, essais de manœuvre et vérification de la recopie de position.</w:t>
-            </w:r>
-          </w:p>
-        </w:tc>
-        <w:tc>
-          <w:tcPr>
-            <w:tcW w:type="dxa" w:w="700"/>
-            <w:tcMar>
-              <w:top w:type="dxa" w:w="60"/>
-              <w:left w:type="dxa" w:w="100"/>
-              <w:bottom w:type="dxa" w:w="60"/>
-              <w:right w:type="dxa" w:w="100"/>
-            </w:tcMar>
-            <w:vAlign w:val="center"/>
-          </w:tcPr>
-          <w:p>
-            <w:pPr>
-              <w:spacing w:after="0"/>
-              <w:jc w:val="center"/>
-            </w:pPr>
-            <w:r>
-              <w:rPr>
-                <w:rFonts w:ascii="Calibri" w:cs="Calibri" w:eastAsia="Calibri" w:hAnsi="Calibri"/>
-                <w:b w:val="false"/>
-                <w:bCs w:val="false"/>
-                <w:i w:val="false"/>
-                <w:iCs w:val="false"/>
-                <w:color w:val="000000"/>
-                <w:sz w:val="18"/>
-                <w:szCs w:val="18"/>
-              </w:rPr>
-              <w:t xml:space="preserve">1</w:t>
-            </w:r>
-          </w:p>
-        </w:tc>
-        <w:tc>
-          <w:tcPr>
-            <w:tcW w:type="dxa" w:w="1600"/>
-            <w:tcMar>
-              <w:top w:type="dxa" w:w="60"/>
-              <w:left w:type="dxa" w:w="100"/>
-              <w:bottom w:type="dxa" w:w="60"/>
-              <w:right w:type="dxa" w:w="100"/>
-            </w:tcMar>
-            <w:vAlign w:val="center"/>
-          </w:tcPr>
-          <w:p>
-            <w:pPr>
-              <w:spacing w:after="0"/>
-              <w:jc w:val="right"/>
-            </w:pPr>
-            <w:r>
-              <w:rPr>
-                <w:rFonts w:ascii="Calibri" w:cs="Calibri" w:eastAsia="Calibri" w:hAnsi="Calibri"/>
-                <w:b w:val="false"/>
-                <w:bCs w:val="false"/>
-                <w:i w:val="false"/>
-                <w:iCs w:val="false"/>
-                <w:color w:val="000000"/>
-                <w:sz w:val="18"/>
-                <w:szCs w:val="18"/>
-              </w:rPr>
-              <w:t xml:space="preserve">750 000</w:t>
-            </w:r>
-          </w:p>
-        </w:tc>
-        <w:tc>
-          <w:tcPr>
-            <w:tcW w:type="dxa" w:w="1800"/>
-            <w:tcMar>
-              <w:top w:type="dxa" w:w="60"/>
-              <w:left w:type="dxa" w:w="100"/>
-              <w:bottom w:type="dxa" w:w="60"/>
-              <w:right w:type="dxa" w:w="100"/>
-            </w:tcMar>
-            <w:vAlign w:val="center"/>
-          </w:tcPr>
-          <w:p>
-            <w:pPr>
-              <w:spacing w:after="0"/>
-              <w:jc w:val="right"/>
-            </w:pPr>
-            <w:r>
-              <w:rPr>
-                <w:rFonts w:ascii="Calibri" w:cs="Calibri" w:eastAsia="Calibri" w:hAnsi="Calibri"/>
-                <w:b/>
-                <w:bCs/>
-                <w:i w:val="false"/>
-                <w:iCs w:val="false"/>
-                <w:color w:val="000000"/>
-                <w:sz w:val="18"/>
-                <w:szCs w:val="18"/>
-              </w:rPr>
-              <w:t xml:space="preserve">750 000</w:t>
-            </w:r>
-          </w:p>
-        </w:tc>
-      </w:tr>
-      <w:tr>
-        <w:tc>
-          <w:tcPr>
-            <w:tcW w:type="dxa" w:w="600"/>
-            <w:tcMar>
-              <w:top w:type="dxa" w:w="60"/>
-              <w:left w:type="dxa" w:w="100"/>
-              <w:bottom w:type="dxa" w:w="60"/>
-              <w:right w:type="dxa" w:w="100"/>
-            </w:tcMar>
-            <w:vAlign w:val="center"/>
-          </w:tcPr>
-          <w:p>
-            <w:pPr>
-              <w:spacing w:after="0"/>
-              <w:jc w:val="center"/>
-            </w:pPr>
-            <w:r>
-              <w:rPr>
-                <w:rFonts w:ascii="Calibri" w:cs="Calibri" w:eastAsia="Calibri" w:hAnsi="Calibri"/>
-                <w:b w:val="false"/>
-                <w:bCs w:val="false"/>
-                <w:i w:val="false"/>
-                <w:iCs w:val="false"/>
-                <w:color w:val="000000"/>
-                <w:sz w:val="18"/>
-                <w:szCs w:val="18"/>
-              </w:rPr>
-              <w:t xml:space="preserve">3</w:t>
-            </w:r>
-          </w:p>
-        </w:tc>
-        <w:tc>
-          <w:tcPr>
-            <w:tcW w:type="dxa" w:w="5200"/>
-            <w:tcMar>
-              <w:top w:type="dxa" w:w="60"/>
-              <w:left w:type="dxa" w:w="100"/>
-              <w:bottom w:type="dxa" w:w="60"/>
-              <w:right w:type="dxa" w:w="100"/>
-            </w:tcMar>
-            <w:vAlign w:val="center"/>
-          </w:tcPr>
-          <w:p>
-            <w:pPr>
-              <w:spacing w:after="0"/>
-              <w:jc w:val="left"/>
-            </w:pPr>
-            <w:r>
-              <w:rPr>
-                <w:rFonts w:ascii="Calibri" w:cs="Calibri" w:eastAsia="Calibri" w:hAnsi="Calibri"/>
-                <w:b/>
-                <w:bCs/>
-                <w:i w:val="false"/>
-                <w:iCs w:val="false"/>
-                <w:color w:val="000000"/>
-                <w:sz w:val="18"/>
-                <w:szCs w:val="18"/>
-              </w:rPr>
-              <w:t xml:space="preserve">Transmetteur de pression SIEMENS SITRANS P320</w:t>
+              <w:t xml:space="preserve">réétalonnage 5 points avec certificat de vérification raccordé étalon.</w:t>
             </w:r>
           </w:p>
           <w:p>
@@ -1096,7 +939,164 @@
                 <w:sz w:val="16"/>
                 <w:szCs w:val="16"/>
               </w:rPr>
-              <w:t xml:space="preserve">Réf. 7MF03D0-1VE01-5AF2-Z · 4-20 mA HART · 10,5-45 V DC · IP66</w:t>
+              <w:t xml:space="preserve">Prestation applicable à chacun des trois transmetteurs confiés.</w:t>
+            </w:r>
+          </w:p>
+        </w:tc>
+        <w:tc>
+          <w:tcPr>
+            <w:tcW w:type="dxa" w:w="700"/>
+            <w:tcMar>
+              <w:top w:type="dxa" w:w="60"/>
+              <w:left w:type="dxa" w:w="100"/>
+              <w:bottom w:type="dxa" w:w="60"/>
+              <w:right w:type="dxa" w:w="100"/>
+            </w:tcMar>
+            <w:vAlign w:val="center"/>
+          </w:tcPr>
+          <w:p>
+            <w:pPr>
+              <w:spacing w:after="0"/>
+              <w:jc w:val="center"/>
+            </w:pPr>
+            <w:r>
+              <w:rPr>
+                <w:rFonts w:ascii="Calibri" w:cs="Calibri" w:eastAsia="Calibri" w:hAnsi="Calibri"/>
+                <w:b w:val="false"/>
+                <w:bCs w:val="false"/>
+                <w:i w:val="false"/>
+                <w:iCs w:val="false"/>
+                <w:color w:val="000000"/>
+                <w:sz w:val="18"/>
+                <w:szCs w:val="18"/>
+              </w:rPr>
+              <w:t xml:space="preserve">3</w:t>
+            </w:r>
+          </w:p>
+        </w:tc>
+        <w:tc>
+          <w:tcPr>
+            <w:tcW w:type="dxa" w:w="1600"/>
+            <w:tcMar>
+              <w:top w:type="dxa" w:w="60"/>
+              <w:left w:type="dxa" w:w="100"/>
+              <w:bottom w:type="dxa" w:w="60"/>
+              <w:right w:type="dxa" w:w="100"/>
+            </w:tcMar>
+            <w:vAlign w:val="center"/>
+          </w:tcPr>
+          <w:p>
+            <w:pPr>
+              <w:spacing w:after="0"/>
+              <w:jc w:val="right"/>
+            </w:pPr>
+            <w:r>
+              <w:rPr>
+                <w:rFonts w:ascii="Calibri" w:cs="Calibri" w:eastAsia="Calibri" w:hAnsi="Calibri"/>
+                <w:b w:val="false"/>
+                <w:bCs w:val="false"/>
+                <w:i w:val="false"/>
+                <w:iCs w:val="false"/>
+                <w:color w:val="000000"/>
+                <w:sz w:val="18"/>
+                <w:szCs w:val="18"/>
+              </w:rPr>
+              <w:t xml:space="preserve">395 000</w:t>
+            </w:r>
+          </w:p>
+        </w:tc>
+        <w:tc>
+          <w:tcPr>
+            <w:tcW w:type="dxa" w:w="1800"/>
+            <w:tcMar>
+              <w:top w:type="dxa" w:w="60"/>
+              <w:left w:type="dxa" w:w="100"/>
+              <w:bottom w:type="dxa" w:w="60"/>
+              <w:right w:type="dxa" w:w="100"/>
+            </w:tcMar>
+            <w:vAlign w:val="center"/>
+          </w:tcPr>
+          <w:p>
+            <w:pPr>
+              <w:spacing w:after="0"/>
+              <w:jc w:val="right"/>
+            </w:pPr>
+            <w:r>
+              <w:rPr>
+                <w:rFonts w:ascii="Calibri" w:cs="Calibri" w:eastAsia="Calibri" w:hAnsi="Calibri"/>
+                <w:b/>
+                <w:bCs/>
+                <w:i w:val="false"/>
+                <w:iCs w:val="false"/>
+                <w:color w:val="000000"/>
+                <w:sz w:val="18"/>
+                <w:szCs w:val="18"/>
+              </w:rPr>
+              <w:t xml:space="preserve">1 185 000</w:t>
+            </w:r>
+          </w:p>
+        </w:tc>
+      </w:tr>
+      <w:tr>
+        <w:tc>
+          <w:tcPr>
+            <w:tcW w:type="dxa" w:w="600"/>
+            <w:tcMar>
+              <w:top w:type="dxa" w:w="60"/>
+              <w:left w:type="dxa" w:w="100"/>
+              <w:bottom w:type="dxa" w:w="60"/>
+              <w:right w:type="dxa" w:w="100"/>
+            </w:tcMar>
+            <w:vAlign w:val="center"/>
+          </w:tcPr>
+          <w:p>
+            <w:pPr>
+              <w:spacing w:after="0"/>
+              <w:jc w:val="center"/>
+            </w:pPr>
+            <w:r>
+              <w:rPr>
+                <w:rFonts w:ascii="Calibri" w:cs="Calibri" w:eastAsia="Calibri" w:hAnsi="Calibri"/>
+                <w:b w:val="false"/>
+                <w:bCs w:val="false"/>
+                <w:i w:val="false"/>
+                <w:iCs w:val="false"/>
+                <w:color w:val="000000"/>
+                <w:sz w:val="18"/>
+                <w:szCs w:val="18"/>
+              </w:rPr>
+              <w:t xml:space="preserve">3</w:t>
+            </w:r>
+          </w:p>
+        </w:tc>
+        <w:tc>
+          <w:tcPr>
+            <w:tcW w:type="dxa" w:w="5200"/>
+            <w:tcMar>
+              <w:top w:type="dxa" w:w="60"/>
+              <w:left w:type="dxa" w:w="100"/>
+              <w:bottom w:type="dxa" w:w="60"/>
+              <w:right w:type="dxa" w:w="100"/>
+            </w:tcMar>
+            <w:vAlign w:val="center"/>
+          </w:tcPr>
+          <w:p>
+            <w:pPr>
+              <w:spacing w:after="0"/>
+              <w:jc w:val="left"/>
+            </w:pPr>
+            <w:r>
+              <w:rPr>
+                <w:rFonts w:ascii="Calibri" w:cs="Calibri" w:eastAsia="Calibri" w:hAnsi="Calibri"/>
+                <w:b/>
+                <w:bCs/>
+                <w:i w:val="false"/>
+                <w:iCs w:val="false"/>
+                <w:color w:val="000000"/>
+                <w:sz w:val="18"/>
+                <w:szCs w:val="18"/>
+              </w:rPr>
+              <w:t xml:space="preserve">Positionneur de vanne ROTORK YTC YT-200</w:t>
             </w:r>
           </w:p>
           <w:p>
@@ -1115,7 +1115,7 @@
                 <w:sz w:val="16"/>
                 <w:szCs w:val="16"/>
               </w:rPr>
-              <w:t xml:space="preserve">Diagnostic électronique, remise en état, contrôle d’étanchéité de la cellule,</w:t>
+              <w:t xml:space="preserve">Révision complète : nettoyage du bloc pneumatique, remplacement du kit joints</w:t>
             </w:r>
           </w:p>
           <w:p>
@@ -1134,164 +1134,7 @@
                 <w:sz w:val="16"/>
                 <w:szCs w:val="16"/>
               </w:rPr>
-              <w:t xml:space="preserve">réétalonnage 5 points avec certificat de vérification raccordé étalon.</w:t>
-            </w:r>
-          </w:p>
-        </w:tc>
-        <w:tc>
-          <w:tcPr>
-            <w:tcW w:type="dxa" w:w="700"/>
-            <w:tcMar>
-              <w:top w:type="dxa" w:w="60"/>
-              <w:left w:type="dxa" w:w="100"/>
-              <w:bottom w:type="dxa" w:w="60"/>
-              <w:right w:type="dxa" w:w="100"/>
-            </w:tcMar>
-            <w:vAlign w:val="center"/>
-          </w:tcPr>
-          <w:p>
-            <w:pPr>
-              <w:spacing w:after="0"/>
-              <w:jc w:val="center"/>
-            </w:pPr>
-            <w:r>
-              <w:rPr>
-                <w:rFonts w:ascii="Calibri" w:cs="Calibri" w:eastAsia="Calibri" w:hAnsi="Calibri"/>
-                <w:b w:val="false"/>
-                <w:bCs w:val="false"/>
-                <w:i w:val="false"/>
-                <w:iCs w:val="false"/>
-                <w:color w:val="000000"/>
-                <w:sz w:val="18"/>
-                <w:szCs w:val="18"/>
-              </w:rPr>
-              <w:t xml:space="preserve">1</w:t>
-            </w:r>
-          </w:p>
-        </w:tc>
-        <w:tc>
-          <w:tcPr>
-            <w:tcW w:type="dxa" w:w="1600"/>
-            <w:tcMar>
-              <w:top w:type="dxa" w:w="60"/>
-              <w:left w:type="dxa" w:w="100"/>
-              <w:bottom w:type="dxa" w:w="60"/>
-              <w:right w:type="dxa" w:w="100"/>
-            </w:tcMar>
-            <w:vAlign w:val="center"/>
-          </w:tcPr>
-          <w:p>
-            <w:pPr>
-              <w:spacing w:after="0"/>
-              <w:jc w:val="right"/>
-            </w:pPr>
-            <w:r>
-              <w:rPr>
-                <w:rFonts w:ascii="Calibri" w:cs="Calibri" w:eastAsia="Calibri" w:hAnsi="Calibri"/>
-                <w:b w:val="false"/>
-                <w:bCs w:val="false"/>
-                <w:i w:val="false"/>
-                <w:iCs w:val="false"/>
-                <w:color w:val="000000"/>
-                <w:sz w:val="18"/>
-                <w:szCs w:val="18"/>
-              </w:rPr>
-              <w:t xml:space="preserve">395 000</w:t>
-            </w:r>
-          </w:p>
-        </w:tc>
-        <w:tc>
-          <w:tcPr>
-            <w:tcW w:type="dxa" w:w="1800"/>
-            <w:tcMar>
-              <w:top w:type="dxa" w:w="60"/>
-              <w:left w:type="dxa" w:w="100"/>
-              <w:bottom w:type="dxa" w:w="60"/>
-              <w:right w:type="dxa" w:w="100"/>
-            </w:tcMar>
-            <w:vAlign w:val="center"/>
-          </w:tcPr>
-          <w:p>
-            <w:pPr>
-              <w:spacing w:after="0"/>
-              <w:jc w:val="right"/>
-            </w:pPr>
-            <w:r>
-              <w:rPr>
-                <w:rFonts w:ascii="Calibri" w:cs="Calibri" w:eastAsia="Calibri" w:hAnsi="Calibri"/>
-                <w:b/>
-                <w:bCs/>
-                <w:i w:val="false"/>
-                <w:iCs w:val="false"/>
-                <w:color w:val="000000"/>
-                <w:sz w:val="18"/>
-                <w:szCs w:val="18"/>
-              </w:rPr>
-              <w:t xml:space="preserve">395 000</w:t>
-            </w:r>
-          </w:p>
-        </w:tc>
-      </w:tr>
-      <w:tr>
-        <w:tc>
-          <w:tcPr>
-            <w:tcW w:type="dxa" w:w="600"/>
-            <w:tcMar>
-              <w:top w:type="dxa" w:w="60"/>
-              <w:left w:type="dxa" w:w="100"/>
-              <w:bottom w:type="dxa" w:w="60"/>
-              <w:right w:type="dxa" w:w="100"/>
-            </w:tcMar>
-            <w:vAlign w:val="center"/>
-          </w:tcPr>
-          <w:p>
-            <w:pPr>
-              <w:spacing w:after="0"/>
-              <w:jc w:val="center"/>
-            </w:pPr>
-            <w:r>
-              <w:rPr>
-                <w:rFonts w:ascii="Calibri" w:cs="Calibri" w:eastAsia="Calibri" w:hAnsi="Calibri"/>
-                <w:b w:val="false"/>
-                <w:bCs w:val="false"/>
-                <w:i w:val="false"/>
-                <w:iCs w:val="false"/>
-                <w:color w:val="000000"/>
-                <w:sz w:val="18"/>
-                <w:szCs w:val="18"/>
-              </w:rPr>
-              <w:t xml:space="preserve">4</w:t>
-            </w:r>
-          </w:p>
-        </w:tc>
-        <w:tc>
-          <w:tcPr>
-            <w:tcW w:type="dxa" w:w="5200"/>
-            <w:tcMar>
-              <w:top w:type="dxa" w:w="60"/>
-              <w:left w:type="dxa" w:w="100"/>
-              <w:bottom w:type="dxa" w:w="60"/>
-              <w:right w:type="dxa" w:w="100"/>
-            </w:tcMar>
-            <w:vAlign w:val="center"/>
-          </w:tcPr>
-          <w:p>
-            <w:pPr>
-              <w:spacing w:after="0"/>
-              <w:jc w:val="left"/>
-            </w:pPr>
-            <w:r>
-              <w:rPr>
-                <w:rFonts w:ascii="Calibri" w:cs="Calibri" w:eastAsia="Calibri" w:hAnsi="Calibri"/>
-                <w:b/>
-                <w:bCs/>
-                <w:i w:val="false"/>
-                <w:iCs w:val="false"/>
-                <w:color w:val="000000"/>
-                <w:sz w:val="18"/>
-                <w:szCs w:val="18"/>
-              </w:rPr>
-              <w:t xml:space="preserve">Positionneur de vanne ROTORK YTC YT-200</w:t>
+              <w:t xml:space="preserve">et du relais pilote, réglage de la course, calibration du signal 4-20 mA,</w:t>
             </w:r>
           </w:p>
           <w:p>
@@ -1310,7 +1153,164 @@
                 <w:sz w:val="16"/>
                 <w:szCs w:val="16"/>
               </w:rPr>
-              <w:t xml:space="preserve">Révision complète : nettoyage du bloc pneumatique, remplacement du kit joints</w:t>
+              <w:t xml:space="preserve">essais de réponse et de linéarité sur banc.</w:t>
+            </w:r>
+          </w:p>
+        </w:tc>
+        <w:tc>
+          <w:tcPr>
+            <w:tcW w:type="dxa" w:w="700"/>
+            <w:tcMar>
+              <w:top w:type="dxa" w:w="60"/>
+              <w:left w:type="dxa" w:w="100"/>
+              <w:bottom w:type="dxa" w:w="60"/>
+              <w:right w:type="dxa" w:w="100"/>
+            </w:tcMar>
+            <w:vAlign w:val="center"/>
+          </w:tcPr>
+          <w:p>
+            <w:pPr>
+              <w:spacing w:after="0"/>
+              <w:jc w:val="center"/>
+            </w:pPr>
+            <w:r>
+              <w:rPr>
+                <w:rFonts w:ascii="Calibri" w:cs="Calibri" w:eastAsia="Calibri" w:hAnsi="Calibri"/>
+                <w:b w:val="false"/>
+                <w:bCs w:val="false"/>
+                <w:i w:val="false"/>
+                <w:iCs w:val="false"/>
+                <w:color w:val="000000"/>
+                <w:sz w:val="18"/>
+                <w:szCs w:val="18"/>
+              </w:rPr>
+              <w:t xml:space="preserve">1</w:t>
+            </w:r>
+          </w:p>
+        </w:tc>
+        <w:tc>
+          <w:tcPr>
+            <w:tcW w:type="dxa" w:w="1600"/>
+            <w:tcMar>
+              <w:top w:type="dxa" w:w="60"/>
+              <w:left w:type="dxa" w:w="100"/>
+              <w:bottom w:type="dxa" w:w="60"/>
+              <w:right w:type="dxa" w:w="100"/>
+            </w:tcMar>
+            <w:vAlign w:val="center"/>
+          </w:tcPr>
+          <w:p>
+            <w:pPr>
+              <w:spacing w:after="0"/>
+              <w:jc w:val="right"/>
+            </w:pPr>
+            <w:r>
+              <w:rPr>
+                <w:rFonts w:ascii="Calibri" w:cs="Calibri" w:eastAsia="Calibri" w:hAnsi="Calibri"/>
+                <w:b w:val="false"/>
+                <w:bCs w:val="false"/>
+                <w:i w:val="false"/>
+                <w:iCs w:val="false"/>
+                <w:color w:val="000000"/>
+                <w:sz w:val="18"/>
+                <w:szCs w:val="18"/>
+              </w:rPr>
+              <w:t xml:space="preserve">275 000</w:t>
+            </w:r>
+          </w:p>
+        </w:tc>
+        <w:tc>
+          <w:tcPr>
+            <w:tcW w:type="dxa" w:w="1800"/>
+            <w:tcMar>
+              <w:top w:type="dxa" w:w="60"/>
+              <w:left w:type="dxa" w:w="100"/>
+              <w:bottom w:type="dxa" w:w="60"/>
+              <w:right w:type="dxa" w:w="100"/>
+            </w:tcMar>
+            <w:vAlign w:val="center"/>
+          </w:tcPr>
+          <w:p>
+            <w:pPr>
+              <w:spacing w:after="0"/>
+              <w:jc w:val="right"/>
+            </w:pPr>
+            <w:r>
+              <w:rPr>
+                <w:rFonts w:ascii="Calibri" w:cs="Calibri" w:eastAsia="Calibri" w:hAnsi="Calibri"/>
+                <w:b/>
+                <w:bCs/>
+                <w:i w:val="false"/>
+                <w:iCs w:val="false"/>
+                <w:color w:val="000000"/>
+                <w:sz w:val="18"/>
+                <w:szCs w:val="18"/>
+              </w:rPr>
+              <w:t xml:space="preserve">275 000</w:t>
+            </w:r>
+          </w:p>
+        </w:tc>
+      </w:tr>
+      <w:tr>
+        <w:tc>
+          <w:tcPr>
+            <w:tcW w:type="dxa" w:w="600"/>
+            <w:tcMar>
+              <w:top w:type="dxa" w:w="60"/>
+              <w:left w:type="dxa" w:w="100"/>
+              <w:bottom w:type="dxa" w:w="60"/>
+              <w:right w:type="dxa" w:w="100"/>
+            </w:tcMar>
+            <w:vAlign w:val="center"/>
+          </w:tcPr>
+          <w:p>
+            <w:pPr>
+              <w:spacing w:after="0"/>
+              <w:jc w:val="center"/>
+            </w:pPr>
+            <w:r>
+              <w:rPr>
+                <w:rFonts w:ascii="Calibri" w:cs="Calibri" w:eastAsia="Calibri" w:hAnsi="Calibri"/>
+                <w:b w:val="false"/>
+                <w:bCs w:val="false"/>
+                <w:i w:val="false"/>
+                <w:iCs w:val="false"/>
+                <w:color w:val="000000"/>
+                <w:sz w:val="18"/>
+                <w:szCs w:val="18"/>
+              </w:rPr>
+              <w:t xml:space="preserve">4</w:t>
+            </w:r>
+          </w:p>
+        </w:tc>
+        <w:tc>
+          <w:tcPr>
+            <w:tcW w:type="dxa" w:w="5200"/>
+            <w:tcMar>
+              <w:top w:type="dxa" w:w="60"/>
+              <w:left w:type="dxa" w:w="100"/>
+              <w:bottom w:type="dxa" w:w="60"/>
+              <w:right w:type="dxa" w:w="100"/>
+            </w:tcMar>
+            <w:vAlign w:val="center"/>
+          </w:tcPr>
+          <w:p>
+            <w:pPr>
+              <w:spacing w:after="0"/>
+              <w:jc w:val="left"/>
+            </w:pPr>
+            <w:r>
+              <w:rPr>
+                <w:rFonts w:ascii="Calibri" w:cs="Calibri" w:eastAsia="Calibri" w:hAnsi="Calibri"/>
+                <w:b/>
+                <w:bCs/>
+                <w:i w:val="false"/>
+                <w:iCs w:val="false"/>
+                <w:color w:val="000000"/>
+                <w:sz w:val="18"/>
+                <w:szCs w:val="18"/>
+              </w:rPr>
+              <w:t xml:space="preserve">Alimentation PULS DIMENSION CP10.481 (repère -FA1)</w:t>
             </w:r>
           </w:p>
           <w:p>
@@ -1329,7 +1329,7 @@
                 <w:sz w:val="16"/>
                 <w:szCs w:val="16"/>
               </w:rPr>
-              <w:t xml:space="preserve">et du relais pilote, réglage de la course, calibration du signal 4-20 mA,</w:t>
+              <w:t xml:space="preserve">48 V DC / 5,4 A · entrée 100-240 V AC · contact DC-ok 13/14</w:t>
             </w:r>
           </w:p>
           <w:p>
@@ -1348,164 +1348,7 @@
                 <w:sz w:val="16"/>
                 <w:szCs w:val="16"/>
               </w:rPr>
-              <w:t xml:space="preserve">essais de réponse et de linéarité sur banc.</w:t>
-            </w:r>
-          </w:p>
-        </w:tc>
-        <w:tc>
-          <w:tcPr>
-            <w:tcW w:type="dxa" w:w="700"/>
-            <w:tcMar>
-              <w:top w:type="dxa" w:w="60"/>
-              <w:left w:type="dxa" w:w="100"/>
-              <w:bottom w:type="dxa" w:w="60"/>
-              <w:right w:type="dxa" w:w="100"/>
-            </w:tcMar>
-            <w:vAlign w:val="center"/>
-          </w:tcPr>
-          <w:p>
-            <w:pPr>
-              <w:spacing w:after="0"/>
-              <w:jc w:val="center"/>
-            </w:pPr>
-            <w:r>
-              <w:rPr>
-                <w:rFonts w:ascii="Calibri" w:cs="Calibri" w:eastAsia="Calibri" w:hAnsi="Calibri"/>
-                <w:b w:val="false"/>
-                <w:bCs w:val="false"/>
-                <w:i w:val="false"/>
-                <w:iCs w:val="false"/>
-                <w:color w:val="000000"/>
-                <w:sz w:val="18"/>
-                <w:szCs w:val="18"/>
-              </w:rPr>
-              <w:t xml:space="preserve">1</w:t>
-            </w:r>
-          </w:p>
-        </w:tc>
-        <w:tc>
-          <w:tcPr>
-            <w:tcW w:type="dxa" w:w="1600"/>
-            <w:tcMar>
-              <w:top w:type="dxa" w:w="60"/>
-              <w:left w:type="dxa" w:w="100"/>
-              <w:bottom w:type="dxa" w:w="60"/>
-              <w:right w:type="dxa" w:w="100"/>
-            </w:tcMar>
-            <w:vAlign w:val="center"/>
-          </w:tcPr>
-          <w:p>
-            <w:pPr>
-              <w:spacing w:after="0"/>
-              <w:jc w:val="right"/>
-            </w:pPr>
-            <w:r>
-              <w:rPr>
-                <w:rFonts w:ascii="Calibri" w:cs="Calibri" w:eastAsia="Calibri" w:hAnsi="Calibri"/>
-                <w:b w:val="false"/>
-                <w:bCs w:val="false"/>
-                <w:i w:val="false"/>
-                <w:iCs w:val="false"/>
-                <w:color w:val="000000"/>
-                <w:sz w:val="18"/>
-                <w:szCs w:val="18"/>
-              </w:rPr>
-              <w:t xml:space="preserve">320 000</w:t>
-            </w:r>
-          </w:p>
-        </w:tc>
-        <w:tc>
-          <w:tcPr>
-            <w:tcW w:type="dxa" w:w="1800"/>
-            <w:tcMar>
-              <w:top w:type="dxa" w:w="60"/>
-              <w:left w:type="dxa" w:w="100"/>
-              <w:bottom w:type="dxa" w:w="60"/>
-              <w:right w:type="dxa" w:w="100"/>
-            </w:tcMar>
-            <w:vAlign w:val="center"/>
-          </w:tcPr>
-          <w:p>
-            <w:pPr>
-              <w:spacing w:after="0"/>
-              <w:jc w:val="right"/>
-            </w:pPr>
-            <w:r>
-              <w:rPr>
-                <w:rFonts w:ascii="Calibri" w:cs="Calibri" w:eastAsia="Calibri" w:hAnsi="Calibri"/>
-                <w:b/>
-                <w:bCs/>
-                <w:i w:val="false"/>
-                <w:iCs w:val="false"/>
-                <w:color w:val="000000"/>
-                <w:sz w:val="18"/>
-                <w:szCs w:val="18"/>
-              </w:rPr>
-              <w:t xml:space="preserve">320 000</w:t>
-            </w:r>
-          </w:p>
-        </w:tc>
-      </w:tr>
-      <w:tr>
-        <w:tc>
-          <w:tcPr>
-            <w:tcW w:type="dxa" w:w="600"/>
-            <w:tcMar>
-              <w:top w:type="dxa" w:w="60"/>
-              <w:left w:type="dxa" w:w="100"/>
-              <w:bottom w:type="dxa" w:w="60"/>
-              <w:right w:type="dxa" w:w="100"/>
-            </w:tcMar>
-            <w:vAlign w:val="center"/>
-          </w:tcPr>
-          <w:p>
-            <w:pPr>
-              <w:spacing w:after="0"/>
-              <w:jc w:val="center"/>
-            </w:pPr>
-            <w:r>
-              <w:rPr>
-                <w:rFonts w:ascii="Calibri" w:cs="Calibri" w:eastAsia="Calibri" w:hAnsi="Calibri"/>
-                <w:b w:val="false"/>
-                <w:bCs w:val="false"/>
-                <w:i w:val="false"/>
-                <w:iCs w:val="false"/>
-                <w:color w:val="000000"/>
-                <w:sz w:val="18"/>
-                <w:szCs w:val="18"/>
-              </w:rPr>
-              <w:t xml:space="preserve">5</w:t>
-            </w:r>
-          </w:p>
-        </w:tc>
-        <w:tc>
-          <w:tcPr>
-            <w:tcW w:type="dxa" w:w="5200"/>
-            <w:tcMar>
-              <w:top w:type="dxa" w:w="60"/>
-              <w:left w:type="dxa" w:w="100"/>
-              <w:bottom w:type="dxa" w:w="60"/>
-              <w:right w:type="dxa" w:w="100"/>
-            </w:tcMar>
-            <w:vAlign w:val="center"/>
-          </w:tcPr>
-          <w:p>
-            <w:pPr>
-              <w:spacing w:after="0"/>
-              <w:jc w:val="left"/>
-            </w:pPr>
-            <w:r>
-              <w:rPr>
-                <w:rFonts w:ascii="Calibri" w:cs="Calibri" w:eastAsia="Calibri" w:hAnsi="Calibri"/>
-                <w:b/>
-                <w:bCs/>
-                <w:i w:val="false"/>
-                <w:iCs w:val="false"/>
-                <w:color w:val="000000"/>
-                <w:sz w:val="18"/>
-                <w:szCs w:val="18"/>
-              </w:rPr>
-              <w:t xml:space="preserve">Alimentation PULS DIMENSION CP10.481 (repère -FA1)</w:t>
+              <w:t xml:space="preserve">Réparation des étages primaire et secondaire, remplacement des condensateurs</w:t>
             </w:r>
           </w:p>
           <w:p>
@@ -1524,7 +1367,195 @@
                 <w:sz w:val="16"/>
                 <w:szCs w:val="16"/>
               </w:rPr>
-              <w:t xml:space="preserve">48 V DC / 5,4 A · entrée 100-240 V AC · contact DC-ok 13/14</w:t>
+              <w:t xml:space="preserve">électrolytiques et du circuit de commutation, essais en charge sur 8 heures.</w:t>
+            </w:r>
+          </w:p>
+        </w:tc>
+        <w:tc>
+          <w:tcPr>
+            <w:tcW w:type="dxa" w:w="700"/>
+            <w:tcMar>
+              <w:top w:type="dxa" w:w="60"/>
+              <w:left w:type="dxa" w:w="100"/>
+              <w:bottom w:type="dxa" w:w="60"/>
+              <w:right w:type="dxa" w:w="100"/>
+            </w:tcMar>
+            <w:vAlign w:val="center"/>
+          </w:tcPr>
+          <w:p>
+            <w:pPr>
+              <w:spacing w:after="0"/>
+              <w:jc w:val="center"/>
+            </w:pPr>
+            <w:r>
+              <w:rPr>
+                <w:rFonts w:ascii="Calibri" w:cs="Calibri" w:eastAsia="Calibri" w:hAnsi="Calibri"/>
+                <w:b w:val="false"/>
+                <w:bCs w:val="false"/>
+                <w:i w:val="false"/>
+                <w:iCs w:val="false"/>
+                <w:color w:val="000000"/>
+                <w:sz w:val="18"/>
+                <w:szCs w:val="18"/>
+              </w:rPr>
+              <w:t xml:space="preserve">1</w:t>
+            </w:r>
+          </w:p>
+        </w:tc>
+        <w:tc>
+          <w:tcPr>
+            <w:tcW w:type="dxa" w:w="1600"/>
+            <w:tcMar>
+              <w:top w:type="dxa" w:w="60"/>
+              <w:left w:type="dxa" w:w="100"/>
+              <w:bottom w:type="dxa" w:w="60"/>
+              <w:right w:type="dxa" w:w="100"/>
+            </w:tcMar>
+            <w:vAlign w:val="center"/>
+          </w:tcPr>
+          <w:p>
+            <w:pPr>
+              <w:spacing w:after="0"/>
+              <w:jc w:val="right"/>
+            </w:pPr>
+            <w:r>
+              <w:rPr>
+                <w:rFonts w:ascii="Calibri" w:cs="Calibri" w:eastAsia="Calibri" w:hAnsi="Calibri"/>
+                <w:b w:val="false"/>
+                <w:bCs w:val="false"/>
+                <w:i w:val="false"/>
+                <w:iCs w:val="false"/>
+                <w:color w:val="000000"/>
+                <w:sz w:val="18"/>
+                <w:szCs w:val="18"/>
+              </w:rPr>
+              <w:t xml:space="preserve">185 000</w:t>
+            </w:r>
+          </w:p>
+        </w:tc>
+        <w:tc>
+          <w:tcPr>
+            <w:tcW w:type="dxa" w:w="1800"/>
+            <w:tcMar>
+              <w:top w:type="dxa" w:w="60"/>
+              <w:left w:type="dxa" w:w="100"/>
+              <w:bottom w:type="dxa" w:w="60"/>
+              <w:right w:type="dxa" w:w="100"/>
+            </w:tcMar>
+            <w:vAlign w:val="center"/>
+          </w:tcPr>
+          <w:p>
+            <w:pPr>
+              <w:spacing w:after="0"/>
+              <w:jc w:val="right"/>
+            </w:pPr>
+            <w:r>
+              <w:rPr>
+                <w:rFonts w:ascii="Calibri" w:cs="Calibri" w:eastAsia="Calibri" w:hAnsi="Calibri"/>
+                <w:b/>
+                <w:bCs/>
+                <w:i w:val="false"/>
+                <w:iCs w:val="false"/>
+                <w:color w:val="000000"/>
+                <w:sz w:val="18"/>
+                <w:szCs w:val="18"/>
+              </w:rPr>
+              <w:t xml:space="preserve">185 000</w:t>
+            </w:r>
+          </w:p>
+        </w:tc>
+      </w:tr>
+      <w:tr>
+        <w:tc>
+          <w:tcPr>
+            <w:tcW w:type="dxa" w:w="9900"/>
+            <w:gridSpan w:val="5"/>
+            <w:shd w:fill="F2F2F2" w:color="auto" w:val="clear"/>
+            <w:tcMar>
+              <w:top w:type="dxa" w:w="60"/>
+              <w:left w:type="dxa" w:w="100"/>
+              <w:bottom w:type="dxa" w:w="60"/>
+              <w:right w:type="dxa" w:w="100"/>
+            </w:tcMar>
+          </w:tcPr>
+          <w:p>
+            <w:pPr>
+              <w:spacing w:after="0"/>
+            </w:pPr>
+            <w:r>
+              <w:rPr>
+                <w:rFonts w:ascii="Calibri" w:cs="Calibri" w:eastAsia="Calibri" w:hAnsi="Calibri"/>
+                <w:b/>
+                <w:bCs/>
+                <w:color w:val="1F3864"/>
+                <w:sz w:val="18"/>
+                <w:szCs w:val="18"/>
+              </w:rPr>
+              <w:t xml:space="preserve">B — PIÈCES DÉTACHÉES ET CONSOMMABLES</w:t>
+            </w:r>
+          </w:p>
+        </w:tc>
+      </w:tr>
+      <w:tr>
+        <w:tc>
+          <w:tcPr>
+            <w:tcW w:type="dxa" w:w="600"/>
+            <w:tcMar>
+              <w:top w:type="dxa" w:w="60"/>
+              <w:left w:type="dxa" w:w="100"/>
+              <w:bottom w:type="dxa" w:w="60"/>
+              <w:right w:type="dxa" w:w="100"/>
+            </w:tcMar>
+            <w:vAlign w:val="center"/>
+          </w:tcPr>
+          <w:p>
+            <w:pPr>
+              <w:spacing w:after="0"/>
+              <w:jc w:val="center"/>
+            </w:pPr>
+            <w:r>
+              <w:rPr>
+                <w:rFonts w:ascii="Calibri" w:cs="Calibri" w:eastAsia="Calibri" w:hAnsi="Calibri"/>
+                <w:b w:val="false"/>
+                <w:bCs w:val="false"/>
+                <w:i w:val="false"/>
+                <w:iCs w:val="false"/>
+                <w:color w:val="000000"/>
+                <w:sz w:val="18"/>
+                <w:szCs w:val="18"/>
+              </w:rPr>
+              <w:t xml:space="preserve">5</w:t>
+            </w:r>
+          </w:p>
+        </w:tc>
+        <w:tc>
+          <w:tcPr>
+            <w:tcW w:type="dxa" w:w="5200"/>
+            <w:tcMar>
+              <w:top w:type="dxa" w:w="60"/>
+              <w:left w:type="dxa" w:w="100"/>
+              <w:bottom w:type="dxa" w:w="60"/>
+              <w:right w:type="dxa" w:w="100"/>
+            </w:tcMar>
+            <w:vAlign w:val="center"/>
+          </w:tcPr>
+          <w:p>
+            <w:pPr>
+              <w:spacing w:after="0"/>
+              <w:jc w:val="left"/>
+            </w:pPr>
+            <w:r>
+              <w:rPr>
+                <w:rFonts w:ascii="Calibri" w:cs="Calibri" w:eastAsia="Calibri" w:hAnsi="Calibri"/>
+                <w:b/>
+                <w:bCs/>
+                <w:i w:val="false"/>
+                <w:iCs w:val="false"/>
+                <w:color w:val="000000"/>
+                <w:sz w:val="18"/>
+                <w:szCs w:val="18"/>
+              </w:rPr>
+              <w:t xml:space="preserve">Kit de composants électroniques</w:t>
             </w:r>
           </w:p>
           <w:p>
@@ -1543,7 +1574,7 @@
                 <w:sz w:val="16"/>
                 <w:szCs w:val="16"/>
               </w:rPr>
-              <w:t xml:space="preserve">Réparation des étages primaire et secondaire, remplacement des condensateurs</w:t>
+              <w:t xml:space="preserve">Relais de puissance, condensateurs, optocoupleurs, régulateurs, borniers,</w:t>
             </w:r>
           </w:p>
           <w:p>
@@ -1562,7 +1593,7 @@
                 <w:sz w:val="16"/>
                 <w:szCs w:val="16"/>
               </w:rPr>
-              <w:t xml:space="preserve">électrolytiques et du circuit de commutation, essais en charge sur 8 heures.</w:t>
+              <w:t xml:space="preserve">connecteurs et composants de commutation.</w:t>
             </w:r>
           </w:p>
         </w:tc>
@@ -1624,7 +1655,7 @@
                 <w:sz w:val="18"/>
                 <w:szCs w:val="18"/>
               </w:rPr>
-              <w:t xml:space="preserve">185 000</w:t>
+              <w:t xml:space="preserve">275 000</w:t>
             </w:r>
           </w:p>
         </w:tc>
@@ -1655,7 +1686,7 @@
                 <w:sz w:val="18"/>
                 <w:szCs w:val="18"/>
               </w:rPr>
-              <w:t xml:space="preserve">185 000</w:t>
+              <w:t xml:space="preserve">275 000</w:t>
             </w:r>
           </w:p>
         </w:tc>
@@ -1663,37 +1694,6 @@
       <w:tr>
         <w:tc>
           <w:tcPr>
-            <w:tcW w:type="dxa" w:w="9900"/>
-            <w:gridSpan w:val="5"/>
-            <w:shd w:fill="F2F2F2" w:color="auto" w:val="clear"/>
-            <w:tcMar>
-              <w:top w:type="dxa" w:w="60"/>
-              <w:left w:type="dxa" w:w="100"/>
-              <w:bottom w:type="dxa" w:w="60"/>
-              <w:right w:type="dxa" w:w="100"/>
-            </w:tcMar>
-          </w:tcPr>
-          <w:p>
-            <w:pPr>
-              <w:spacing w:after="0"/>
-            </w:pPr>
-            <w:r>
-              <w:rPr>
-                <w:rFonts w:ascii="Calibri" w:cs="Calibri" w:eastAsia="Calibri" w:hAnsi="Calibri"/>
-                <w:b/>
-                <w:bCs/>
-                <w:color w:val="1F3864"/>
-                <w:sz w:val="18"/>
-                <w:szCs w:val="18"/>
-              </w:rPr>
-              <w:t xml:space="preserve">B — PIÈCES DÉTACHÉES ET CONSOMMABLES</w:t>
-            </w:r>
-          </w:p>
-        </w:tc>
-      </w:tr>
-      <w:tr>
-        <w:tc>
-          <w:tcPr>
             <w:tcW w:type="dxa" w:w="600"/>
             <w:tcMar>
               <w:top w:type="dxa" w:w="60"/>
@@ -1750,7 +1750,7 @@
                 <w:sz w:val="18"/>
                 <w:szCs w:val="18"/>
               </w:rPr>
-              <w:t xml:space="preserve">Kit de composants électroniques</w:t>
+              <w:t xml:space="preserve">Consommables d’atelier</w:t>
             </w:r>
           </w:p>
           <w:p>
@@ -1769,7 +1769,7 @@
                 <w:sz w:val="16"/>
                 <w:szCs w:val="16"/>
               </w:rPr>
-              <w:t xml:space="preserve">Relais de puissance, condensateurs, optocoupleurs, régulateurs, borniers,</w:t>
+              <w:t xml:space="preserve">Soudure, tresse à dessouder, vernis de tropicalisation, produits de nettoyage,</w:t>
             </w:r>
           </w:p>
           <w:p>
@@ -1788,7 +1788,7 @@
                 <w:sz w:val="16"/>
                 <w:szCs w:val="16"/>
               </w:rPr>
-              <w:t xml:space="preserve">connecteurs et composants de commutation.</w:t>
+              <w:t xml:space="preserve">gaines thermorétractables et visserie.</w:t>
             </w:r>
           </w:p>
         </w:tc>
@@ -1850,7 +1850,7 @@
                 <w:sz w:val="18"/>
                 <w:szCs w:val="18"/>
               </w:rPr>
-              <w:t xml:space="preserve">275 000</w:t>
+              <w:t xml:space="preserve">45 000</w:t>
             </w:r>
           </w:p>
         </w:tc>
@@ -1881,7 +1881,7 @@
                 <w:sz w:val="18"/>
                 <w:szCs w:val="18"/>
               </w:rPr>
-              <w:t xml:space="preserve">275 000</w:t>
+              <w:t xml:space="preserve">45 000</w:t>
             </w:r>
           </w:p>
         </w:tc>
@@ -1889,6 +1889,37 @@
       <w:tr>
         <w:tc>
           <w:tcPr>
+            <w:tcW w:type="dxa" w:w="9900"/>
+            <w:gridSpan w:val="5"/>
+            <w:shd w:fill="F2F2F2" w:color="auto" w:val="clear"/>
+            <w:tcMar>
+              <w:top w:type="dxa" w:w="60"/>
+              <w:left w:type="dxa" w:w="100"/>
+              <w:bottom w:type="dxa" w:w="60"/>
+              <w:right w:type="dxa" w:w="100"/>
+            </w:tcMar>
+          </w:tcPr>
+          <w:p>
+            <w:pPr>
+              <w:spacing w:after="0"/>
+            </w:pPr>
+            <w:r>
+              <w:rPr>
+                <w:rFonts w:ascii="Calibri" w:cs="Calibri" w:eastAsia="Calibri" w:hAnsi="Calibri"/>
+                <w:b/>
+                <w:bCs/>
+                <w:color w:val="1F3864"/>
+                <w:sz w:val="18"/>
+                <w:szCs w:val="18"/>
+              </w:rPr>
+              <w:t xml:space="preserve">C — ESSAIS, LOGISTIQUE ET DOCUMENTATION</w:t>
+            </w:r>
+          </w:p>
+        </w:tc>
+      </w:tr>
+      <w:tr>
+        <w:tc>
+          <w:tcPr>
             <w:tcW w:type="dxa" w:w="600"/>
             <w:tcMar>
               <w:top w:type="dxa" w:w="60"/>
@@ -1945,7 +1976,7 @@
                 <w:sz w:val="18"/>
                 <w:szCs w:val="18"/>
               </w:rPr>
-              <w:t xml:space="preserve">Consommables d’atelier</w:t>
+              <w:t xml:space="preserve">Essais de validation sur banc et rapport de test</w:t>
             </w:r>
           </w:p>
           <w:p>
@@ -1964,26 +1995,7 @@
                 <w:sz w:val="16"/>
                 <w:szCs w:val="16"/>
               </w:rPr>
-              <w:t xml:space="preserve">Soudure, tresse à dessouder, vernis de tropicalisation, produits de nettoyage,</w:t>
-            </w:r>
-          </w:p>
-          <w:p>
-            <w:pPr>
-              <w:spacing w:after="0"/>
-              <w:jc w:val="left"/>
-            </w:pPr>
-            <w:r>
-              <w:rPr>
-                <w:rFonts w:ascii="Calibri" w:cs="Calibri" w:eastAsia="Calibri" w:hAnsi="Calibri"/>
-                <w:b/>
-                <w:bCs/>
-                <w:i/>
-                <w:iCs/>
-                <w:color w:val="595959"/>
-                <w:sz w:val="16"/>
-                <w:szCs w:val="16"/>
-              </w:rPr>
-              <w:t xml:space="preserve">gaines thermorétractables et visserie.</w:t>
+              <w:t xml:space="preserve">Par équipement, avant restitution.</w:t>
             </w:r>
           </w:p>
         </w:tc>
@@ -2014,7 +2026,7 @@
                 <w:sz w:val="18"/>
                 <w:szCs w:val="18"/>
               </w:rPr>
-              <w:t xml:space="preserve">1</w:t>
+              <w:t xml:space="preserve">6</w:t>
             </w:r>
           </w:p>
         </w:tc>
@@ -2045,7 +2057,7 @@
                 <w:sz w:val="18"/>
                 <w:szCs w:val="18"/>
               </w:rPr>
-              <w:t xml:space="preserve">45 000</w:t>
+              <w:t xml:space="preserve">35 000</w:t>
             </w:r>
           </w:p>
         </w:tc>
@@ -2076,7 +2088,7 @@
                 <w:sz w:val="18"/>
                 <w:szCs w:val="18"/>
               </w:rPr>
-              <w:t xml:space="preserve">45 000</w:t>
+              <w:t xml:space="preserve">210 000</w:t>
             </w:r>
           </w:p>
         </w:tc>
@@ -2084,37 +2096,6 @@
       <w:tr>
         <w:tc>
           <w:tcPr>
-            <w:tcW w:type="dxa" w:w="9900"/>
-            <w:gridSpan w:val="5"/>
-            <w:shd w:fill="F2F2F2" w:color="auto" w:val="clear"/>
-            <w:tcMar>
-              <w:top w:type="dxa" w:w="60"/>
-              <w:left w:type="dxa" w:w="100"/>
-              <w:bottom w:type="dxa" w:w="60"/>
-              <w:right w:type="dxa" w:w="100"/>
-            </w:tcMar>
-          </w:tcPr>
-          <w:p>
-            <w:pPr>
-              <w:spacing w:after="0"/>
-            </w:pPr>
-            <w:r>
-              <w:rPr>
-                <w:rFonts w:ascii="Calibri" w:cs="Calibri" w:eastAsia="Calibri" w:hAnsi="Calibri"/>
-                <w:b/>
-                <w:bCs/>
-                <w:color w:val="1F3864"/>
-                <w:sz w:val="18"/>
-                <w:szCs w:val="18"/>
-              </w:rPr>
-              <w:t xml:space="preserve">C — ESSAIS, LOGISTIQUE ET DOCUMENTATION</w:t>
-            </w:r>
-          </w:p>
-        </w:tc>
-      </w:tr>
-      <w:tr>
-        <w:tc>
-          <w:tcPr>
             <w:tcW w:type="dxa" w:w="600"/>
             <w:tcMar>
               <w:top w:type="dxa" w:w="60"/>
@@ -2141,358 +2122,6 @@
                 <w:szCs w:val="18"/>
               </w:rPr>
               <w:t xml:space="preserve">8</w:t>
-            </w:r>
-          </w:p>
-        </w:tc>
-        <w:tc>
-          <w:tcPr>
-            <w:tcW w:type="dxa" w:w="5200"/>
-            <w:tcMar>
-              <w:top w:type="dxa" w:w="60"/>
-              <w:left w:type="dxa" w:w="100"/>
-              <w:bottom w:type="dxa" w:w="60"/>
-              <w:right w:type="dxa" w:w="100"/>
-            </w:tcMar>
-            <w:vAlign w:val="center"/>
-          </w:tcPr>
-          <w:p>
-            <w:pPr>
-              <w:spacing w:after="0"/>
-              <w:jc w:val="left"/>
-            </w:pPr>
-            <w:r>
-              <w:rPr>
-                <w:rFonts w:ascii="Calibri" w:cs="Calibri" w:eastAsia="Calibri" w:hAnsi="Calibri"/>
-                <w:b/>
-                <w:bCs/>
-                <w:i w:val="false"/>
-                <w:iCs w:val="false"/>
-                <w:color w:val="000000"/>
-                <w:sz w:val="18"/>
-                <w:szCs w:val="18"/>
-              </w:rPr>
-              <w:t xml:space="preserve">Essais de validation sur banc et rapport de test</w:t>
-            </w:r>
-          </w:p>
-          <w:p>
-            <w:pPr>
-              <w:spacing w:after="0"/>
-              <w:jc w:val="left"/>
-            </w:pPr>
-            <w:r>
-              <w:rPr>
-                <w:rFonts w:ascii="Calibri" w:cs="Calibri" w:eastAsia="Calibri" w:hAnsi="Calibri"/>
-                <w:b/>
-                <w:bCs/>
-                <w:i/>
-                <w:iCs/>
-                <w:color w:val="595959"/>
-                <w:sz w:val="16"/>
-                <w:szCs w:val="16"/>
-              </w:rPr>
-              <w:t xml:space="preserve">Par équipement, avant restitution.</w:t>
-            </w:r>
-          </w:p>
-        </w:tc>
-        <w:tc>
-          <w:tcPr>
-            <w:tcW w:type="dxa" w:w="700"/>
-            <w:tcMar>
-              <w:top w:type="dxa" w:w="60"/>
-              <w:left w:type="dxa" w:w="100"/>
-              <w:bottom w:type="dxa" w:w="60"/>
-              <w:right w:type="dxa" w:w="100"/>
-            </w:tcMar>
-            <w:vAlign w:val="center"/>
-          </w:tcPr>
-          <w:p>
-            <w:pPr>
-              <w:spacing w:after="0"/>
-              <w:jc w:val="center"/>
-            </w:pPr>
-            <w:r>
-              <w:rPr>
-                <w:rFonts w:ascii="Calibri" w:cs="Calibri" w:eastAsia="Calibri" w:hAnsi="Calibri"/>
-                <w:b w:val="false"/>
-                <w:bCs w:val="false"/>
-                <w:i w:val="false"/>
-                <w:iCs w:val="false"/>
-                <w:color w:val="000000"/>
-                <w:sz w:val="18"/>
-                <w:szCs w:val="18"/>
-              </w:rPr>
-              <w:t xml:space="preserve">5</w:t>
-            </w:r>
-          </w:p>
-        </w:tc>
-        <w:tc>
-          <w:tcPr>
-            <w:tcW w:type="dxa" w:w="1600"/>
-            <w:tcMar>
-              <w:top w:type="dxa" w:w="60"/>
-              <w:left w:type="dxa" w:w="100"/>
-              <w:bottom w:type="dxa" w:w="60"/>
-              <w:right w:type="dxa" w:w="100"/>
-            </w:tcMar>
-            <w:vAlign w:val="center"/>
-          </w:tcPr>
-          <w:p>
-            <w:pPr>
-              <w:spacing w:after="0"/>
-              <w:jc w:val="right"/>
-            </w:pPr>
-            <w:r>
-              <w:rPr>
-                <w:rFonts w:ascii="Calibri" w:cs="Calibri" w:eastAsia="Calibri" w:hAnsi="Calibri"/>
-                <w:b w:val="false"/>
-                <w:bCs w:val="false"/>
-                <w:i w:val="false"/>
-                <w:iCs w:val="false"/>
-                <w:color w:val="000000"/>
-                <w:sz w:val="18"/>
-                <w:szCs w:val="18"/>
-              </w:rPr>
-              <w:t xml:space="preserve">35 000</w:t>
-            </w:r>
-          </w:p>
-        </w:tc>
-        <w:tc>
-          <w:tcPr>
-            <w:tcW w:type="dxa" w:w="1800"/>
-            <w:tcMar>
-              <w:top w:type="dxa" w:w="60"/>
-              <w:left w:type="dxa" w:w="100"/>
-              <w:bottom w:type="dxa" w:w="60"/>
-              <w:right w:type="dxa" w:w="100"/>
-            </w:tcMar>
-            <w:vAlign w:val="center"/>
-          </w:tcPr>
-          <w:p>
-            <w:pPr>
-              <w:spacing w:after="0"/>
-              <w:jc w:val="right"/>
-            </w:pPr>
-            <w:r>
-              <w:rPr>
-                <w:rFonts w:ascii="Calibri" w:cs="Calibri" w:eastAsia="Calibri" w:hAnsi="Calibri"/>
-                <w:b/>
-                <w:bCs/>
-                <w:i w:val="false"/>
-                <w:iCs w:val="false"/>
-                <w:color w:val="000000"/>
-                <w:sz w:val="18"/>
-                <w:szCs w:val="18"/>
-              </w:rPr>
-              <w:t xml:space="preserve">175 000</w:t>
-            </w:r>
-          </w:p>
-        </w:tc>
-      </w:tr>
-      <w:tr>
-        <w:tc>
-          <w:tcPr>
-            <w:tcW w:type="dxa" w:w="600"/>
-            <w:tcMar>
-              <w:top w:type="dxa" w:w="60"/>
-              <w:left w:type="dxa" w:w="100"/>
-              <w:bottom w:type="dxa" w:w="60"/>
-              <w:right w:type="dxa" w:w="100"/>
-            </w:tcMar>
-            <w:vAlign w:val="center"/>
-          </w:tcPr>
-          <w:p>
-            <w:pPr>
-              <w:spacing w:after="0"/>
-              <w:jc w:val="center"/>
-            </w:pPr>
-            <w:r>
-              <w:rPr>
-                <w:rFonts w:ascii="Calibri" w:cs="Calibri" w:eastAsia="Calibri" w:hAnsi="Calibri"/>
-                <w:b w:val="false"/>
-                <w:bCs w:val="false"/>
-                <w:i w:val="false"/>
-                <w:iCs w:val="false"/>
-                <w:color w:val="000000"/>
-                <w:sz w:val="18"/>
-                <w:szCs w:val="18"/>
-              </w:rPr>
-              <w:t xml:space="preserve">9</w:t>
-            </w:r>
-          </w:p>
-        </w:tc>
-        <w:tc>
-          <w:tcPr>
-            <w:tcW w:type="dxa" w:w="5200"/>
-            <w:tcMar>
-              <w:top w:type="dxa" w:w="60"/>
-              <w:left w:type="dxa" w:w="100"/>
-              <w:bottom w:type="dxa" w:w="60"/>
-              <w:right w:type="dxa" w:w="100"/>
-            </w:tcMar>
-            <w:vAlign w:val="center"/>
-          </w:tcPr>
-          <w:p>
-            <w:pPr>
-              <w:spacing w:after="0"/>
-              <w:jc w:val="left"/>
-            </w:pPr>
-            <w:r>
-              <w:rPr>
-                <w:rFonts w:ascii="Calibri" w:cs="Calibri" w:eastAsia="Calibri" w:hAnsi="Calibri"/>
-                <w:b/>
-                <w:bCs/>
-                <w:i w:val="false"/>
-                <w:iCs w:val="false"/>
-                <w:color w:val="000000"/>
-                <w:sz w:val="18"/>
-                <w:szCs w:val="18"/>
-              </w:rPr>
-              <w:t xml:space="preserve">Enlèvement et restitution du matériel</w:t>
-            </w:r>
-          </w:p>
-          <w:p>
-            <w:pPr>
-              <w:spacing w:after="0"/>
-              <w:jc w:val="left"/>
-            </w:pPr>
-            <w:r>
-              <w:rPr>
-                <w:rFonts w:ascii="Calibri" w:cs="Calibri" w:eastAsia="Calibri" w:hAnsi="Calibri"/>
-                <w:b/>
-                <w:bCs/>
-                <w:i/>
-                <w:iCs/>
-                <w:color w:val="595959"/>
-                <w:sz w:val="16"/>
-                <w:szCs w:val="16"/>
-              </w:rPr>
-              <w:t xml:space="preserve">Rotation atelier ↔ site Atinkou, transport et manutention inclus.</w:t>
-            </w:r>
-          </w:p>
-        </w:tc>
-        <w:tc>
-          <w:tcPr>
-            <w:tcW w:type="dxa" w:w="700"/>
-            <w:tcMar>
-              <w:top w:type="dxa" w:w="60"/>
-              <w:left w:type="dxa" w:w="100"/>
-              <w:bottom w:type="dxa" w:w="60"/>
-              <w:right w:type="dxa" w:w="100"/>
-            </w:tcMar>
-            <w:vAlign w:val="center"/>
-          </w:tcPr>
-          <w:p>
-            <w:pPr>
-              <w:spacing w:after="0"/>
-              <w:jc w:val="center"/>
-            </w:pPr>
-            <w:r>
-              <w:rPr>
-                <w:rFonts w:ascii="Calibri" w:cs="Calibri" w:eastAsia="Calibri" w:hAnsi="Calibri"/>
-                <w:b w:val="false"/>
-                <w:bCs w:val="false"/>
-                <w:i w:val="false"/>
-                <w:iCs w:val="false"/>
-                <w:color w:val="000000"/>
-                <w:sz w:val="18"/>
-                <w:szCs w:val="18"/>
-              </w:rPr>
-              <w:t xml:space="preserve">2</w:t>
-            </w:r>
-          </w:p>
-        </w:tc>
-        <w:tc>
-          <w:tcPr>
-            <w:tcW w:type="dxa" w:w="1600"/>
-            <w:tcMar>
-              <w:top w:type="dxa" w:w="60"/>
-              <w:left w:type="dxa" w:w="100"/>
-              <w:bottom w:type="dxa" w:w="60"/>
-              <w:right w:type="dxa" w:w="100"/>
-            </w:tcMar>
-            <w:vAlign w:val="center"/>
-          </w:tcPr>
-          <w:p>
-            <w:pPr>
-              <w:spacing w:after="0"/>
-              <w:jc w:val="right"/>
-            </w:pPr>
-            <w:r>
-              <w:rPr>
-                <w:rFonts w:ascii="Calibri" w:cs="Calibri" w:eastAsia="Calibri" w:hAnsi="Calibri"/>
-                <w:b w:val="false"/>
-                <w:bCs w:val="false"/>
-                <w:i w:val="false"/>
-                <w:iCs w:val="false"/>
-                <w:color w:val="000000"/>
-                <w:sz w:val="18"/>
-                <w:szCs w:val="18"/>
-              </w:rPr>
-              <w:t xml:space="preserve">90 000</w:t>
-            </w:r>
-          </w:p>
-        </w:tc>
-        <w:tc>
-          <w:tcPr>
-            <w:tcW w:type="dxa" w:w="1800"/>
-            <w:tcMar>
-              <w:top w:type="dxa" w:w="60"/>
-              <w:left w:type="dxa" w:w="100"/>
-              <w:bottom w:type="dxa" w:w="60"/>
-              <w:right w:type="dxa" w:w="100"/>
-            </w:tcMar>
-            <w:vAlign w:val="center"/>
-          </w:tcPr>
-          <w:p>
-            <w:pPr>
-              <w:spacing w:after="0"/>
-              <w:jc w:val="right"/>
-            </w:pPr>
-            <w:r>
-              <w:rPr>
-                <w:rFonts w:ascii="Calibri" w:cs="Calibri" w:eastAsia="Calibri" w:hAnsi="Calibri"/>
-                <w:b/>
-                <w:bCs/>
-                <w:i w:val="false"/>
-                <w:iCs w:val="false"/>
-                <w:color w:val="000000"/>
-                <w:sz w:val="18"/>
-                <w:szCs w:val="18"/>
-              </w:rPr>
-              <w:t xml:space="preserve">180 000</w:t>
-            </w:r>
-          </w:p>
-        </w:tc>
-      </w:tr>
-      <w:tr>
-        <w:tc>
-          <w:tcPr>
-            <w:tcW w:type="dxa" w:w="600"/>
-            <w:tcMar>
-              <w:top w:type="dxa" w:w="60"/>
-              <w:left w:type="dxa" w:w="100"/>
-              <w:bottom w:type="dxa" w:w="60"/>
-              <w:right w:type="dxa" w:w="100"/>
-            </w:tcMar>
-            <w:vAlign w:val="center"/>
-          </w:tcPr>
-          <w:p>
-            <w:pPr>
-              <w:spacing w:after="0"/>
-              <w:jc w:val="center"/>
-            </w:pPr>
-            <w:r>
-              <w:rPr>
-                <w:rFonts w:ascii="Calibri" w:cs="Calibri" w:eastAsia="Calibri" w:hAnsi="Calibri"/>
-                <w:b w:val="false"/>
-                <w:bCs w:val="false"/>
-                <w:i w:val="false"/>
-                <w:iCs w:val="false"/>
-                <w:color w:val="000000"/>
-                <w:sz w:val="18"/>
-                <w:szCs w:val="18"/>
-              </w:rPr>
-              <w:t xml:space="preserve">10</w:t>
             </w:r>
           </w:p>
         </w:tc>
@@ -2718,7 +2347,7 @@
                 <w:sz w:val="18"/>
                 <w:szCs w:val="18"/>
               </w:rPr>
-              <w:t xml:space="preserve">2 870 000</w:t>
+              <w:t xml:space="preserve">2 720 000</w:t>
             </w:r>
           </w:p>
         </w:tc>
@@ -2801,7 +2430,7 @@
                 <w:sz w:val="18"/>
                 <w:szCs w:val="18"/>
               </w:rPr>
-              <w:t xml:space="preserve">- 143 500</w:t>
+              <w:t xml:space="preserve">- 136 000</w:t>
             </w:r>
           </w:p>
         </w:tc>
@@ -2884,7 +2513,7 @@
                 <w:sz w:val="18"/>
                 <w:szCs w:val="18"/>
               </w:rPr>
-              <w:t xml:space="preserve">2 726 500</w:t>
+              <w:t xml:space="preserve">2 584 000</w:t>
             </w:r>
           </w:p>
         </w:tc>
@@ -2967,7 +2596,7 @@
                 <w:sz w:val="18"/>
                 <w:szCs w:val="18"/>
               </w:rPr>
-              <w:t xml:space="preserve">490 770</w:t>
+              <w:t xml:space="preserve">465 120</w:t>
             </w:r>
           </w:p>
         </w:tc>
@@ -3050,7 +2679,7 @@
                 <w:sz w:val="22"/>
                 <w:szCs w:val="22"/>
               </w:rPr>
-              <w:t xml:space="preserve">3 217 270</w:t>
+              <w:t xml:space="preserve">3 049 120</w:t>
             </w:r>
           </w:p>
         </w:tc>
@@ -3078,7 +2707,7 @@
           <w:sz w:val="20"/>
           <w:szCs w:val="20"/>
         </w:rPr>
-        <w:t xml:space="preserve">Arrêté le présent devis proforma à la somme de : 3 217 270 FCFA TTC.</w:t>
+        <w:t xml:space="preserve">Arrêté le présent devis proforma à la somme de : 3 049 120 FCFA TTC.</w:t>
       </w:r>
     </w:p>
     <w:p>
@@ -3303,7 +2932,7 @@
                 <w:sz w:val="18"/>
                 <w:szCs w:val="18"/>
               </w:rPr>
-              <w:t xml:space="preserve">Fourniture d’un transmetteur SIEMENS SITRANS P320 neuf, réf. 7MF03D0-1VE01-5AF2-Z</w:t>
+              <w:t xml:space="preserve">Fourniture d’un transmetteur SIEMENS SITRANS P320 neuf, réf. 7MF03D0-1VE01-5AF2-Z (prix unitaire)</w:t>
             </w:r>
           </w:p>
         </w:tc>
@@ -3610,7 +3239,7 @@
           <w:sz w:val="18"/>
           <w:szCs w:val="18"/>
         </w:rPr>
-        <w:t xml:space="preserve">Le forfait diagnostic est intégré au prix de réparation. En cas de refus du devis après démontage, seuls les frais de diagnostic et de transport restent dus.</w:t>
+        <w:t xml:space="preserve">Le forfait diagnostic est intégré au prix de réparation. En cas de refus du devis après démontage, seuls les frais de diagnostic restent dus.</w:t>
       </w:r>
     </w:p>
     <w:p>
@@ -3650,6 +3279,30 @@
           <w:sz w:val="18"/>
           <w:szCs w:val="18"/>
         </w:rPr>
+        <w:t xml:space="preserve">Logistique : </w:t>
+      </w:r>
+      <w:r>
+        <w:rPr>
+          <w:rFonts w:ascii="Calibri" w:cs="Calibri" w:eastAsia="Calibri" w:hAnsi="Calibri"/>
+          <w:sz w:val="18"/>
+          <w:szCs w:val="18"/>
+        </w:rPr>
+        <w:t xml:space="preserve">L’enlèvement et la restitution du matériel sont à la charge du client. Le matériel doit nous être remis complet, en atelier, accompagné du présent bon de commande.</w:t>
+      </w:r>
+    </w:p>
+    <w:p>
+      <w:pPr>
+        <w:spacing w:after="90"/>
+      </w:pPr>
+      <w:r>
+        <w:rPr>
+          <w:rFonts w:ascii="Calibri" w:cs="Calibri" w:eastAsia="Calibri" w:hAnsi="Calibri"/>
+          <w:b/>
+          <w:bCs/>
+          <w:color w:val="1F3864"/>
+          <w:sz w:val="18"/>
+          <w:szCs w:val="18"/>
+        </w:rPr>
         <w:t xml:space="preserve">Prix : </w:t>
       </w:r>
       <w:r>
@@ -3658,7 +3311,7 @@
           <w:sz w:val="18"/>
           <w:szCs w:val="18"/>
         </w:rPr>
-        <w:t xml:space="preserve">Montants exprimés en francs CFA (XOF), hors taxes, TVA 18 % en sus. Transport et manutention inclus pour deux rotations Abidjan ↔ site.</w:t>
+        <w:t xml:space="preserve">Montants exprimés en francs CFA (XOF), hors taxes, TVA 18 % en sus.</w:t>
       </w:r>
     </w:p>
     <w:p>

</xml_diff>